<commit_message>
practicas 2- 4 entregadas
</commit_message>
<xml_diff>
--- a/laboratorio/repo-avance/lab2/practica2.docx
+++ b/laboratorio/repo-avance/lab2/practica2.docx
@@ -172,6 +172,7 @@
         </w:rPr>
         <w:t xml:space="preserve">Practica </w:t>
       </w:r>
+      <w:proofErr w:type="gramStart"/>
       <w:r>
         <w:rPr>
           <w:rFonts w:ascii="Arial" w:hAnsi="Arial" w:cs="Arial"/>
@@ -179,9 +180,9 @@
           <w:szCs w:val="32"/>
           <w:lang w:val="es-419"/>
         </w:rPr>
-        <w:t xml:space="preserve">2 : programación en lenguaje ASM </w:t>
-      </w:r>
-      <w:proofErr w:type="spellStart"/>
+        <w:t>2 :</w:t>
+      </w:r>
+      <w:proofErr w:type="gramEnd"/>
       <w:r>
         <w:rPr>
           <w:rFonts w:ascii="Arial" w:hAnsi="Arial" w:cs="Arial"/>
@@ -189,9 +190,9 @@
           <w:szCs w:val="32"/>
           <w:lang w:val="es-419"/>
         </w:rPr>
-        <w:t>ATmega</w:t>
-      </w:r>
-      <w:proofErr w:type="spellEnd"/>
+        <w:t xml:space="preserve"> programación en lenguaje ASM </w:t>
+      </w:r>
+      <w:proofErr w:type="spellStart"/>
       <w:r>
         <w:rPr>
           <w:rFonts w:ascii="Arial" w:hAnsi="Arial" w:cs="Arial"/>
@@ -199,8 +200,9 @@
           <w:szCs w:val="32"/>
           <w:lang w:val="es-419"/>
         </w:rPr>
-        <w:t xml:space="preserve"> </w:t>
-      </w:r>
+        <w:t>ATmega</w:t>
+      </w:r>
+      <w:proofErr w:type="spellEnd"/>
       <w:r>
         <w:rPr>
           <w:rFonts w:ascii="Arial" w:hAnsi="Arial" w:cs="Arial"/>
@@ -208,19 +210,17 @@
           <w:szCs w:val="32"/>
           <w:lang w:val="es-419"/>
         </w:rPr>
-        <w:t>2560</w:t>
-      </w:r>
-    </w:p>
-    <w:p>
-      <w:pPr>
-        <w:jc w:val="center"/>
+        <w:t xml:space="preserve"> </w:t>
+      </w:r>
+      <w:r>
         <w:rPr>
           <w:rFonts w:ascii="Arial" w:hAnsi="Arial" w:cs="Arial"/>
           <w:sz w:val="32"/>
           <w:szCs w:val="32"/>
           <w:lang w:val="es-419"/>
         </w:rPr>
-      </w:pPr>
+        <w:t>2560</w:t>
+      </w:r>
     </w:p>
     <w:p>
       <w:pPr>
@@ -232,26 +232,26 @@
           <w:lang w:val="es-419"/>
         </w:rPr>
       </w:pPr>
-      <w:r>
+    </w:p>
+    <w:p>
+      <w:pPr>
+        <w:jc w:val="center"/>
         <w:rPr>
           <w:rFonts w:ascii="Arial" w:hAnsi="Arial" w:cs="Arial"/>
           <w:sz w:val="32"/>
           <w:szCs w:val="32"/>
           <w:lang w:val="es-419"/>
         </w:rPr>
-        <w:t xml:space="preserve">Erik garcia Chávez 01275973 </w:t>
-      </w:r>
-    </w:p>
-    <w:p>
-      <w:pPr>
-        <w:jc w:val="center"/>
+      </w:pPr>
+      <w:r>
         <w:rPr>
           <w:rFonts w:ascii="Arial" w:hAnsi="Arial" w:cs="Arial"/>
           <w:sz w:val="32"/>
           <w:szCs w:val="32"/>
           <w:lang w:val="es-419"/>
         </w:rPr>
-      </w:pPr>
+        <w:t xml:space="preserve">Erik garcia Chávez 01275973 </w:t>
+      </w:r>
     </w:p>
     <w:p>
       <w:pPr>
@@ -263,78 +263,134 @@
           <w:lang w:val="es-419"/>
         </w:rPr>
       </w:pPr>
-      <w:r>
+    </w:p>
+    <w:p>
+      <w:pPr>
+        <w:jc w:val="center"/>
         <w:rPr>
           <w:rFonts w:ascii="Arial" w:hAnsi="Arial" w:cs="Arial"/>
           <w:sz w:val="32"/>
           <w:szCs w:val="32"/>
           <w:lang w:val="es-419"/>
         </w:rPr>
-        <w:t>Itzel barrera cazares</w:t>
-      </w:r>
-    </w:p>
-    <w:p>
-      <w:pPr>
-        <w:jc w:val="center"/>
+      </w:pPr>
+      <w:r>
         <w:rPr>
           <w:rFonts w:ascii="Arial" w:hAnsi="Arial" w:cs="Arial"/>
           <w:sz w:val="32"/>
           <w:szCs w:val="32"/>
           <w:lang w:val="es-419"/>
         </w:rPr>
-      </w:pPr>
-    </w:p>
-    <w:p>
-      <w:pPr>
-        <w:jc w:val="center"/>
+        <w:t>Jesús</w:t>
+      </w:r>
+      <w:r>
         <w:rPr>
           <w:rFonts w:ascii="Arial" w:hAnsi="Arial" w:cs="Arial"/>
           <w:sz w:val="32"/>
           <w:szCs w:val="32"/>
           <w:lang w:val="es-419"/>
         </w:rPr>
-      </w:pPr>
-    </w:p>
-    <w:p>
-      <w:pPr>
-        <w:jc w:val="center"/>
+        <w:t xml:space="preserve"> </w:t>
+      </w:r>
+      <w:r>
         <w:rPr>
           <w:rFonts w:ascii="Arial" w:hAnsi="Arial" w:cs="Arial"/>
           <w:sz w:val="32"/>
           <w:szCs w:val="32"/>
           <w:lang w:val="es-419"/>
         </w:rPr>
-      </w:pPr>
-    </w:p>
-    <w:p>
-      <w:pPr>
-        <w:jc w:val="center"/>
+        <w:t>Adán</w:t>
+      </w:r>
+      <w:r>
         <w:rPr>
           <w:rFonts w:ascii="Arial" w:hAnsi="Arial" w:cs="Arial"/>
           <w:sz w:val="32"/>
           <w:szCs w:val="32"/>
           <w:lang w:val="es-419"/>
         </w:rPr>
-      </w:pPr>
-    </w:p>
-    <w:p>
-      <w:pPr>
-        <w:jc w:val="center"/>
+        <w:t xml:space="preserve"> Garcia </w:t>
+      </w:r>
+      <w:r>
         <w:rPr>
           <w:rFonts w:ascii="Arial" w:hAnsi="Arial" w:cs="Arial"/>
           <w:sz w:val="32"/>
           <w:szCs w:val="32"/>
           <w:lang w:val="es-419"/>
         </w:rPr>
-      </w:pPr>
-      <w:r>
+        <w:t>López</w:t>
+      </w:r>
+    </w:p>
+    <w:p>
+      <w:pPr>
+        <w:jc w:val="center"/>
         <w:rPr>
           <w:rFonts w:ascii="Arial" w:hAnsi="Arial" w:cs="Arial"/>
           <w:sz w:val="32"/>
           <w:szCs w:val="32"/>
           <w:lang w:val="es-419"/>
         </w:rPr>
-        <w:t>11 de febrero del 2025</w:t>
+      </w:pPr>
+    </w:p>
+    <w:p>
+      <w:pPr>
+        <w:jc w:val="center"/>
+        <w:rPr>
+          <w:rFonts w:ascii="Arial" w:hAnsi="Arial" w:cs="Arial"/>
+          <w:sz w:val="32"/>
+          <w:szCs w:val="32"/>
+          <w:lang w:val="es-419"/>
+        </w:rPr>
+      </w:pPr>
+    </w:p>
+    <w:p>
+      <w:pPr>
+        <w:jc w:val="center"/>
+        <w:rPr>
+          <w:rFonts w:ascii="Arial" w:hAnsi="Arial" w:cs="Arial"/>
+          <w:sz w:val="32"/>
+          <w:szCs w:val="32"/>
+          <w:lang w:val="es-419"/>
+        </w:rPr>
+      </w:pPr>
+    </w:p>
+    <w:p>
+      <w:pPr>
+        <w:jc w:val="center"/>
+        <w:rPr>
+          <w:rFonts w:ascii="Arial" w:hAnsi="Arial" w:cs="Arial"/>
+          <w:sz w:val="32"/>
+          <w:szCs w:val="32"/>
+          <w:lang w:val="es-419"/>
+        </w:rPr>
+      </w:pPr>
+    </w:p>
+    <w:p>
+      <w:pPr>
+        <w:jc w:val="center"/>
+        <w:rPr>
+          <w:rFonts w:ascii="Arial" w:hAnsi="Arial" w:cs="Arial"/>
+          <w:sz w:val="32"/>
+          <w:szCs w:val="32"/>
+          <w:lang w:val="es-419"/>
+        </w:rPr>
+      </w:pPr>
+      <w:r>
+        <w:rPr>
+          <w:rFonts w:ascii="Arial" w:hAnsi="Arial" w:cs="Arial"/>
+          <w:sz w:val="32"/>
+          <w:szCs w:val="32"/>
+          <w:lang w:val="es-419"/>
+        </w:rPr>
+        <w:t>21</w:t>
+      </w:r>
+      <w:r>
+        <w:rPr>
+          <w:rFonts w:ascii="Arial" w:hAnsi="Arial" w:cs="Arial"/>
+          <w:sz w:val="32"/>
+          <w:szCs w:val="32"/>
+          <w:lang w:val="es-419"/>
+        </w:rPr>
+        <w:t xml:space="preserve"> de febrero del 2025</w:t>
       </w:r>
     </w:p>
     <w:p>
@@ -1838,27 +1894,16 @@
           <w:rFonts w:ascii="Arial" w:hAnsi="Arial" w:cs="Arial"/>
           <w:sz w:val="24"/>
           <w:szCs w:val="24"/>
-          <w:lang w:val="es-419"/>
-        </w:rPr>
-      </w:pPr>
-      <w:r>
-        <w:rPr>
-          <w:rFonts w:ascii="Arial" w:hAnsi="Arial" w:cs="Arial"/>
-          <w:sz w:val="24"/>
-          <w:szCs w:val="24"/>
-          <w:lang w:val="es-419"/>
-        </w:rPr>
-        <w:t xml:space="preserve">En registros: BSET (set </w:t>
-      </w:r>
+        </w:rPr>
+      </w:pPr>
       <w:proofErr w:type="spellStart"/>
       <w:r>
         <w:rPr>
           <w:rFonts w:ascii="Arial" w:hAnsi="Arial" w:cs="Arial"/>
           <w:sz w:val="24"/>
           <w:szCs w:val="24"/>
-          <w:lang w:val="es-419"/>
-        </w:rPr>
-        <w:t>flag</w:t>
+        </w:rPr>
+        <w:t>En</w:t>
       </w:r>
       <w:proofErr w:type="spellEnd"/>
       <w:r>
@@ -1866,9 +1911,8 @@
           <w:rFonts w:ascii="Arial" w:hAnsi="Arial" w:cs="Arial"/>
           <w:sz w:val="24"/>
           <w:szCs w:val="24"/>
-          <w:lang w:val="es-419"/>
-        </w:rPr>
-        <w:t>), BCLR (</w:t>
+        </w:rPr>
+        <w:t xml:space="preserve"> </w:t>
       </w:r>
       <w:proofErr w:type="spellStart"/>
       <w:r>
@@ -1876,9 +1920,8 @@
           <w:rFonts w:ascii="Arial" w:hAnsi="Arial" w:cs="Arial"/>
           <w:sz w:val="24"/>
           <w:szCs w:val="24"/>
-          <w:lang w:val="es-419"/>
-        </w:rPr>
-        <w:t>clear</w:t>
+        </w:rPr>
+        <w:t>registros</w:t>
       </w:r>
       <w:proofErr w:type="spellEnd"/>
       <w:r>
@@ -1886,29 +1929,8 @@
           <w:rFonts w:ascii="Arial" w:hAnsi="Arial" w:cs="Arial"/>
           <w:sz w:val="24"/>
           <w:szCs w:val="24"/>
-          <w:lang w:val="es-419"/>
-        </w:rPr>
-        <w:t xml:space="preserve"> </w:t>
-      </w:r>
-      <w:proofErr w:type="spellStart"/>
-      <w:r>
-        <w:rPr>
-          <w:rFonts w:ascii="Arial" w:hAnsi="Arial" w:cs="Arial"/>
-          <w:sz w:val="24"/>
-          <w:szCs w:val="24"/>
-          <w:lang w:val="es-419"/>
-        </w:rPr>
-        <w:t>flag</w:t>
-      </w:r>
-      <w:proofErr w:type="spellEnd"/>
-      <w:r>
-        <w:rPr>
-          <w:rFonts w:ascii="Arial" w:hAnsi="Arial" w:cs="Arial"/>
-          <w:sz w:val="24"/>
-          <w:szCs w:val="24"/>
-          <w:lang w:val="es-419"/>
-        </w:rPr>
-        <w:t>).</w:t>
+        </w:rPr>
+        <w:t>: BSET (set flag), BCLR (clear flag).</w:t>
       </w:r>
     </w:p>
     <w:p>
@@ -2499,6 +2521,7 @@
       <w:r>
         <w:rPr>
           <w:rFonts w:ascii="Arial" w:hAnsi="Arial" w:cs="Arial"/>
+          <w:noProof/>
           <w:sz w:val="24"/>
           <w:szCs w:val="24"/>
           <w:lang w:val="es-419"/>
@@ -2709,6 +2732,7 @@
         <w:t xml:space="preserve">) a utilizar el ATmega1280 y presione </w:t>
       </w:r>
       <w:proofErr w:type="spellStart"/>
+      <w:proofErr w:type="gramStart"/>
       <w:r>
         <w:rPr>
           <w:lang w:val="es-419"/>
@@ -2722,29 +2746,31 @@
         </w:rPr>
         <w:t xml:space="preserve"> .</w:t>
       </w:r>
-    </w:p>
-    <w:p>
-      <w:pPr>
-        <w:rPr>
-          <w:rFonts w:ascii="Arial" w:hAnsi="Arial" w:cs="Arial"/>
-          <w:sz w:val="24"/>
-          <w:szCs w:val="24"/>
-          <w:lang w:val="es-419"/>
-        </w:rPr>
-      </w:pPr>
-    </w:p>
-    <w:p>
-      <w:pPr>
-        <w:rPr>
-          <w:rFonts w:ascii="Arial" w:hAnsi="Arial" w:cs="Arial"/>
-          <w:sz w:val="24"/>
-          <w:szCs w:val="24"/>
-          <w:lang w:val="es-419"/>
-        </w:rPr>
-      </w:pPr>
-      <w:r>
-        <w:rPr>
-          <w:rFonts w:ascii="Arial" w:hAnsi="Arial" w:cs="Arial"/>
+      <w:proofErr w:type="gramEnd"/>
+    </w:p>
+    <w:p>
+      <w:pPr>
+        <w:rPr>
+          <w:rFonts w:ascii="Arial" w:hAnsi="Arial" w:cs="Arial"/>
+          <w:sz w:val="24"/>
+          <w:szCs w:val="24"/>
+          <w:lang w:val="es-419"/>
+        </w:rPr>
+      </w:pPr>
+    </w:p>
+    <w:p>
+      <w:pPr>
+        <w:rPr>
+          <w:rFonts w:ascii="Arial" w:hAnsi="Arial" w:cs="Arial"/>
+          <w:sz w:val="24"/>
+          <w:szCs w:val="24"/>
+          <w:lang w:val="es-419"/>
+        </w:rPr>
+      </w:pPr>
+      <w:r>
+        <w:rPr>
+          <w:rFonts w:ascii="Arial" w:hAnsi="Arial" w:cs="Arial"/>
+          <w:noProof/>
           <w:sz w:val="24"/>
           <w:szCs w:val="24"/>
           <w:lang w:val="es-419"/>
@@ -2798,6 +2824,7 @@
       <w:r>
         <w:rPr>
           <w:rFonts w:ascii="Arial" w:hAnsi="Arial" w:cs="Arial"/>
+          <w:noProof/>
           <w:sz w:val="24"/>
           <w:szCs w:val="24"/>
           <w:lang w:val="es-419"/>
@@ -2982,6 +3009,7 @@
       <w:r>
         <w:rPr>
           <w:rFonts w:ascii="Arial" w:hAnsi="Arial" w:cs="Arial"/>
+          <w:noProof/>
           <w:sz w:val="24"/>
           <w:szCs w:val="24"/>
           <w:lang w:val="es-419"/>
@@ -3054,6 +3082,7 @@
       <w:r>
         <w:rPr>
           <w:rFonts w:ascii="Arial" w:hAnsi="Arial" w:cs="Arial"/>
+          <w:noProof/>
           <w:sz w:val="24"/>
           <w:szCs w:val="24"/>
           <w:lang w:val="es-419"/>
@@ -3141,7 +3170,43 @@
           <w:szCs w:val="24"/>
           <w:lang w:val="es-419"/>
         </w:rPr>
-        <w:t xml:space="preserve">En la practica se </w:t>
+        <w:t xml:space="preserve">En la </w:t>
+      </w:r>
+      <w:r>
+        <w:rPr>
+          <w:rFonts w:ascii="Arial" w:hAnsi="Arial" w:cs="Arial"/>
+          <w:sz w:val="24"/>
+          <w:szCs w:val="24"/>
+          <w:lang w:val="es-419"/>
+        </w:rPr>
+        <w:t>práctica</w:t>
+      </w:r>
+      <w:r>
+        <w:rPr>
+          <w:rFonts w:ascii="Arial" w:hAnsi="Arial" w:cs="Arial"/>
+          <w:sz w:val="24"/>
+          <w:szCs w:val="24"/>
+          <w:lang w:val="es-419"/>
+        </w:rPr>
+        <w:t xml:space="preserve"> se </w:t>
+      </w:r>
+      <w:r>
+        <w:rPr>
+          <w:rFonts w:ascii="Arial" w:hAnsi="Arial" w:cs="Arial"/>
+          <w:sz w:val="24"/>
+          <w:szCs w:val="24"/>
+          <w:lang w:val="es-419"/>
+        </w:rPr>
+        <w:t>realizó</w:t>
+      </w:r>
+      <w:r>
+        <w:rPr>
+          <w:rFonts w:ascii="Arial" w:hAnsi="Arial" w:cs="Arial"/>
+          <w:sz w:val="24"/>
+          <w:szCs w:val="24"/>
+          <w:lang w:val="es-419"/>
+        </w:rPr>
+        <w:t xml:space="preserve"> un </w:t>
       </w:r>
       <w:proofErr w:type="spellStart"/>
       <w:r>
@@ -3151,7 +3216,7 @@
           <w:szCs w:val="24"/>
           <w:lang w:val="es-419"/>
         </w:rPr>
-        <w:t>realizo</w:t>
+        <w:t>decode</w:t>
       </w:r>
       <w:proofErr w:type="spellEnd"/>
       <w:r>
@@ -3161,7 +3226,97 @@
           <w:szCs w:val="24"/>
           <w:lang w:val="es-419"/>
         </w:rPr>
-        <w:t xml:space="preserve"> un </w:t>
+        <w:t xml:space="preserve">, el cual se tiene un arreglo con valores hexadecimales los cuales representar operaciones, por lo que se necesita hacer un programa que imprima a que operación se </w:t>
+      </w:r>
+      <w:r>
+        <w:rPr>
+          <w:rFonts w:ascii="Arial" w:hAnsi="Arial" w:cs="Arial"/>
+          <w:sz w:val="24"/>
+          <w:szCs w:val="24"/>
+          <w:lang w:val="es-419"/>
+        </w:rPr>
+        <w:t>está</w:t>
+      </w:r>
+      <w:r>
+        <w:rPr>
+          <w:rFonts w:ascii="Arial" w:hAnsi="Arial" w:cs="Arial"/>
+          <w:sz w:val="24"/>
+          <w:szCs w:val="24"/>
+          <w:lang w:val="es-419"/>
+        </w:rPr>
+        <w:t xml:space="preserve"> </w:t>
+      </w:r>
+      <w:r>
+        <w:rPr>
+          <w:rFonts w:ascii="Arial" w:hAnsi="Arial" w:cs="Arial"/>
+          <w:sz w:val="24"/>
+          <w:szCs w:val="24"/>
+          <w:lang w:val="es-419"/>
+        </w:rPr>
+        <w:t>haciendo</w:t>
+      </w:r>
+      <w:r>
+        <w:rPr>
+          <w:rFonts w:ascii="Arial" w:hAnsi="Arial" w:cs="Arial"/>
+          <w:sz w:val="24"/>
+          <w:szCs w:val="24"/>
+          <w:lang w:val="es-419"/>
+        </w:rPr>
+        <w:t xml:space="preserve"> referencia y a que registros, puede usar </w:t>
+      </w:r>
+      <w:r>
+        <w:rPr>
+          <w:rFonts w:ascii="Arial" w:hAnsi="Arial" w:cs="Arial"/>
+          <w:sz w:val="24"/>
+          <w:szCs w:val="24"/>
+          <w:lang w:val="es-419"/>
+        </w:rPr>
+        <w:t>más</w:t>
+      </w:r>
+      <w:r>
+        <w:rPr>
+          <w:rFonts w:ascii="Arial" w:hAnsi="Arial" w:cs="Arial"/>
+          <w:sz w:val="24"/>
+          <w:szCs w:val="24"/>
+          <w:lang w:val="es-419"/>
+        </w:rPr>
+        <w:t xml:space="preserve"> </w:t>
+      </w:r>
+      <w:r>
+        <w:rPr>
+          <w:rFonts w:ascii="Arial" w:hAnsi="Arial" w:cs="Arial"/>
+          <w:sz w:val="24"/>
+          <w:szCs w:val="24"/>
+          <w:lang w:val="es-419"/>
+        </w:rPr>
+        <w:t>estructuras</w:t>
+      </w:r>
+      <w:r>
+        <w:rPr>
+          <w:rFonts w:ascii="Arial" w:hAnsi="Arial" w:cs="Arial"/>
+          <w:sz w:val="24"/>
+          <w:szCs w:val="24"/>
+          <w:lang w:val="es-419"/>
+        </w:rPr>
+        <w:t xml:space="preserve"> que antes no había usado como las “</w:t>
+      </w:r>
+      <w:r>
+        <w:rPr>
+          <w:rFonts w:ascii="Arial" w:hAnsi="Arial" w:cs="Arial"/>
+          <w:sz w:val="24"/>
+          <w:szCs w:val="24"/>
+          <w:lang w:val="es-419"/>
+        </w:rPr>
+        <w:t>unión</w:t>
+      </w:r>
+      <w:r>
+        <w:rPr>
+          <w:rFonts w:ascii="Arial" w:hAnsi="Arial" w:cs="Arial"/>
+          <w:sz w:val="24"/>
+          <w:szCs w:val="24"/>
+          <w:lang w:val="es-419"/>
+        </w:rPr>
+        <w:t>”, los “</w:t>
       </w:r>
       <w:proofErr w:type="spellStart"/>
       <w:r>
@@ -3171,7 +3326,7 @@
           <w:szCs w:val="24"/>
           <w:lang w:val="es-419"/>
         </w:rPr>
-        <w:t>decode</w:t>
+        <w:t>enum</w:t>
       </w:r>
       <w:proofErr w:type="spellEnd"/>
       <w:r>
@@ -3181,99 +3336,17 @@
           <w:szCs w:val="24"/>
           <w:lang w:val="es-419"/>
         </w:rPr>
-        <w:t xml:space="preserve">, el cual se tiene un arreglo con valores hexadecimales los cuales representar operaciones, por lo que se necesita hacer un programa que imprima a que operación se esta </w:t>
-      </w:r>
-      <w:proofErr w:type="spellStart"/>
-      <w:r>
-        <w:rPr>
-          <w:rFonts w:ascii="Arial" w:hAnsi="Arial" w:cs="Arial"/>
-          <w:sz w:val="24"/>
-          <w:szCs w:val="24"/>
-          <w:lang w:val="es-419"/>
-        </w:rPr>
-        <w:t>haceindo</w:t>
-      </w:r>
-      <w:proofErr w:type="spellEnd"/>
-      <w:r>
-        <w:rPr>
-          <w:rFonts w:ascii="Arial" w:hAnsi="Arial" w:cs="Arial"/>
-          <w:sz w:val="24"/>
-          <w:szCs w:val="24"/>
-          <w:lang w:val="es-419"/>
-        </w:rPr>
-        <w:t xml:space="preserve"> referencia y a que registros, puede usar mas </w:t>
-      </w:r>
-      <w:proofErr w:type="spellStart"/>
-      <w:r>
-        <w:rPr>
-          <w:rFonts w:ascii="Arial" w:hAnsi="Arial" w:cs="Arial"/>
-          <w:sz w:val="24"/>
-          <w:szCs w:val="24"/>
-          <w:lang w:val="es-419"/>
-        </w:rPr>
-        <w:t>estrucutras</w:t>
-      </w:r>
-      <w:proofErr w:type="spellEnd"/>
-      <w:r>
-        <w:rPr>
-          <w:rFonts w:ascii="Arial" w:hAnsi="Arial" w:cs="Arial"/>
-          <w:sz w:val="24"/>
-          <w:szCs w:val="24"/>
-          <w:lang w:val="es-419"/>
-        </w:rPr>
-        <w:t xml:space="preserve"> que antes no había usado como las “</w:t>
-      </w:r>
-      <w:proofErr w:type="spellStart"/>
-      <w:r>
-        <w:rPr>
-          <w:rFonts w:ascii="Arial" w:hAnsi="Arial" w:cs="Arial"/>
-          <w:sz w:val="24"/>
-          <w:szCs w:val="24"/>
-          <w:lang w:val="es-419"/>
-        </w:rPr>
-        <w:t>union</w:t>
-      </w:r>
-      <w:proofErr w:type="spellEnd"/>
-      <w:r>
-        <w:rPr>
-          <w:rFonts w:ascii="Arial" w:hAnsi="Arial" w:cs="Arial"/>
-          <w:sz w:val="24"/>
-          <w:szCs w:val="24"/>
-          <w:lang w:val="es-419"/>
-        </w:rPr>
-        <w:t>”, los “</w:t>
-      </w:r>
-      <w:proofErr w:type="spellStart"/>
-      <w:r>
-        <w:rPr>
-          <w:rFonts w:ascii="Arial" w:hAnsi="Arial" w:cs="Arial"/>
-          <w:sz w:val="24"/>
-          <w:szCs w:val="24"/>
-          <w:lang w:val="es-419"/>
-        </w:rPr>
-        <w:t>enum</w:t>
-      </w:r>
-      <w:proofErr w:type="spellEnd"/>
-      <w:r>
-        <w:rPr>
-          <w:rFonts w:ascii="Arial" w:hAnsi="Arial" w:cs="Arial"/>
-          <w:sz w:val="24"/>
-          <w:szCs w:val="24"/>
-          <w:lang w:val="es-419"/>
-        </w:rPr>
         <w:t xml:space="preserve">” </w:t>
       </w:r>
-      <w:proofErr w:type="spellStart"/>
-      <w:r>
-        <w:rPr>
-          <w:rFonts w:ascii="Arial" w:hAnsi="Arial" w:cs="Arial"/>
-          <w:sz w:val="24"/>
-          <w:szCs w:val="24"/>
-          <w:lang w:val="es-419"/>
-        </w:rPr>
-        <w:t>asi</w:t>
-      </w:r>
-      <w:proofErr w:type="spellEnd"/>
+      <w:r>
+        <w:rPr>
+          <w:rFonts w:ascii="Arial" w:hAnsi="Arial" w:cs="Arial"/>
+          <w:sz w:val="24"/>
+          <w:szCs w:val="24"/>
+          <w:lang w:val="es-419"/>
+        </w:rPr>
+        <w:t>así</w:t>
+      </w:r>
       <w:r>
         <w:rPr>
           <w:rFonts w:ascii="Arial" w:hAnsi="Arial" w:cs="Arial"/>
@@ -3293,17 +3366,15 @@
         <w:lastRenderedPageBreak/>
         <w:t xml:space="preserve">un solo tipo de dato como un entero varios espacios de bits, y no crear nuevas variables y se cuida mucho mas la memoria que en sistemas embebidos es muy poca y el </w:t>
       </w:r>
-      <w:proofErr w:type="spellStart"/>
-      <w:r>
-        <w:rPr>
-          <w:rFonts w:ascii="Arial" w:hAnsi="Arial" w:cs="Arial"/>
-          <w:sz w:val="24"/>
-          <w:szCs w:val="24"/>
-          <w:lang w:val="es-419"/>
-        </w:rPr>
-        <w:t>optmizar</w:t>
-      </w:r>
-      <w:proofErr w:type="spellEnd"/>
+      <w:r>
+        <w:rPr>
+          <w:rFonts w:ascii="Arial" w:hAnsi="Arial" w:cs="Arial"/>
+          <w:sz w:val="24"/>
+          <w:szCs w:val="24"/>
+          <w:lang w:val="es-419"/>
+        </w:rPr>
+        <w:t>optimizar</w:t>
+      </w:r>
       <w:r>
         <w:rPr>
           <w:rFonts w:ascii="Arial" w:hAnsi="Arial" w:cs="Arial"/>

</xml_diff>